<commit_message>
Pdf y docx modificado con foto nueva
</commit_message>
<xml_diff>
--- a/CarpetaDeTrabajo/Laboratorio_1/TP N1_MACac OS.docx
+++ b/CarpetaDeTrabajo/Laboratorio_1/TP N1_MACac OS.docx
@@ -44,12 +44,6 @@
         <w:tblStyle w:val="TableGrid"/>
         <w:tblW w:w="10531" w:type="dxa"/>
         <w:tblInd w:w="0" w:type="dxa"/>
-        <w:tblCellMar>
-          <w:top w:w="0" w:type="dxa"/>
-          <w:left w:w="0" w:type="dxa"/>
-          <w:bottom w:w="0" w:type="dxa"/>
-          <w:right w:w="0" w:type="dxa"/>
-        </w:tblCellMar>
         <w:tblLook w:val="04A0" w:firstRow="1" w:lastRow="0" w:firstColumn="1" w:lastColumn="0" w:noHBand="0" w:noVBand="1"/>
       </w:tblPr>
       <w:tblGrid>
@@ -3355,14 +3349,153 @@
         <w:ind w:left="1043" w:firstLine="0"/>
       </w:pPr>
       <w:r>
-        <w:t xml:space="preserve">Para determinar el valor digital de la señal, las marcas temporales en las que mediríamos serían a la mitad del intervalo, por </w:t>
-      </w:r>
-      <w:r>
-        <w:t>ejemplo,</w:t>
-      </w:r>
-      <w:r>
-        <w:t xml:space="preserve"> en T0, T2 y T4. Ya que si medimos la señal justo donde comienza el cambio temporal, como en el caso de T3, nos encontramos con una tensión intermedia que puede generar errores de lectura. De esta manera, nos aseguramos de que el cambio de tensión ya se encuentra estable y tenemos un nivel 1 o 0 claro y definido.</w:t>
-      </w:r>
+        <w:t>Para determinar el valor digital de la señal, las marcas temporales en las que mediríamos serían a la mitad del intervalo, por ejemplo, en T0, T2 y T4. Ya que si medimos la señal justo donde comienza el cambio temporal, como en el caso de T3, nos encontramos con una tensión intermedia que puede generar errores de lectura. De esta manera, nos aseguramos de que el cambio de tensión ya se encuentra estable y tenemos un nivel 1 o 0 claro y definido.</w:t>
+      </w:r>
+    </w:p>
+    <w:p>
+      <w:pPr>
+        <w:spacing w:after="19" w:line="259" w:lineRule="auto"/>
+        <w:ind w:left="1043" w:firstLine="0"/>
+      </w:pPr>
+      <w:r>
+        <w:rPr>
+          <w:noProof/>
+        </w:rPr>
+        <w:drawing>
+          <wp:anchor distT="0" distB="0" distL="114300" distR="114300" simplePos="0" relativeHeight="251664384" behindDoc="1" locked="0" layoutInCell="1" allowOverlap="1" wp14:anchorId="460AE4E3" wp14:editId="58A0262E">
+            <wp:simplePos x="0" y="0"/>
+            <wp:positionH relativeFrom="column">
+              <wp:posOffset>31750</wp:posOffset>
+            </wp:positionH>
+            <wp:positionV relativeFrom="paragraph">
+              <wp:posOffset>77415</wp:posOffset>
+            </wp:positionV>
+            <wp:extent cx="7005320" cy="2548255"/>
+            <wp:effectExtent l="0" t="0" r="5080" b="4445"/>
+            <wp:wrapNone/>
+            <wp:docPr id="6" name="Imagen 6"/>
+            <wp:cNvGraphicFramePr>
+              <a:graphicFrameLocks xmlns:a="http://schemas.openxmlformats.org/drawingml/2006/main" noChangeAspect="1"/>
+            </wp:cNvGraphicFramePr>
+            <a:graphic xmlns:a="http://schemas.openxmlformats.org/drawingml/2006/main">
+              <a:graphicData uri="http://schemas.openxmlformats.org/drawingml/2006/picture">
+                <pic:pic xmlns:pic="http://schemas.openxmlformats.org/drawingml/2006/picture">
+                  <pic:nvPicPr>
+                    <pic:cNvPr id="0" name="Picture 1"/>
+                    <pic:cNvPicPr>
+                      <a:picLocks noChangeAspect="1" noChangeArrowheads="1"/>
+                    </pic:cNvPicPr>
+                  </pic:nvPicPr>
+                  <pic:blipFill>
+                    <a:blip r:embed="rId16">
+                      <a:extLst>
+                        <a:ext uri="{28A0092B-C50C-407E-A947-70E740481C1C}">
+                          <a14:useLocalDpi xmlns:a14="http://schemas.microsoft.com/office/drawing/2010/main" val="0"/>
+                        </a:ext>
+                      </a:extLst>
+                    </a:blip>
+                    <a:srcRect/>
+                    <a:stretch>
+                      <a:fillRect/>
+                    </a:stretch>
+                  </pic:blipFill>
+                  <pic:spPr bwMode="auto">
+                    <a:xfrm>
+                      <a:off x="0" y="0"/>
+                      <a:ext cx="7005320" cy="2548255"/>
+                    </a:xfrm>
+                    <a:prstGeom prst="rect">
+                      <a:avLst/>
+                    </a:prstGeom>
+                    <a:noFill/>
+                    <a:ln>
+                      <a:noFill/>
+                    </a:ln>
+                  </pic:spPr>
+                </pic:pic>
+              </a:graphicData>
+            </a:graphic>
+          </wp:anchor>
+        </w:drawing>
+      </w:r>
+    </w:p>
+    <w:p>
+      <w:pPr>
+        <w:spacing w:after="19" w:line="259" w:lineRule="auto"/>
+        <w:ind w:left="1043" w:firstLine="0"/>
+      </w:pPr>
+    </w:p>
+    <w:p>
+      <w:pPr>
+        <w:spacing w:after="19" w:line="259" w:lineRule="auto"/>
+        <w:ind w:left="1043" w:firstLine="0"/>
+      </w:pPr>
+    </w:p>
+    <w:p>
+      <w:pPr>
+        <w:spacing w:after="19" w:line="259" w:lineRule="auto"/>
+        <w:ind w:left="1043" w:firstLine="0"/>
+      </w:pPr>
+    </w:p>
+    <w:p>
+      <w:pPr>
+        <w:spacing w:after="19" w:line="259" w:lineRule="auto"/>
+        <w:ind w:left="1043" w:firstLine="0"/>
+      </w:pPr>
+    </w:p>
+    <w:p>
+      <w:pPr>
+        <w:spacing w:after="19" w:line="259" w:lineRule="auto"/>
+        <w:ind w:left="1043" w:firstLine="0"/>
+      </w:pPr>
+    </w:p>
+    <w:p>
+      <w:pPr>
+        <w:spacing w:after="19" w:line="259" w:lineRule="auto"/>
+        <w:ind w:left="1043" w:firstLine="0"/>
+      </w:pPr>
+    </w:p>
+    <w:p>
+      <w:pPr>
+        <w:spacing w:after="19" w:line="259" w:lineRule="auto"/>
+        <w:ind w:left="1043" w:firstLine="0"/>
+      </w:pPr>
+    </w:p>
+    <w:p>
+      <w:pPr>
+        <w:spacing w:after="19" w:line="259" w:lineRule="auto"/>
+        <w:ind w:left="1043" w:firstLine="0"/>
+      </w:pPr>
+    </w:p>
+    <w:p>
+      <w:pPr>
+        <w:spacing w:after="19" w:line="259" w:lineRule="auto"/>
+        <w:ind w:left="1043" w:firstLine="0"/>
+      </w:pPr>
+    </w:p>
+    <w:p>
+      <w:pPr>
+        <w:spacing w:after="19" w:line="259" w:lineRule="auto"/>
+        <w:ind w:left="1043" w:firstLine="0"/>
+      </w:pPr>
+    </w:p>
+    <w:p>
+      <w:pPr>
+        <w:spacing w:after="19" w:line="259" w:lineRule="auto"/>
+        <w:ind w:left="1043" w:firstLine="0"/>
+      </w:pPr>
+    </w:p>
+    <w:p>
+      <w:pPr>
+        <w:spacing w:after="19" w:line="259" w:lineRule="auto"/>
+        <w:ind w:left="1043" w:firstLine="0"/>
+      </w:pPr>
+    </w:p>
+    <w:p>
+      <w:pPr>
+        <w:spacing w:after="19" w:line="259" w:lineRule="auto"/>
+        <w:ind w:left="1043" w:firstLine="0"/>
+      </w:pPr>
     </w:p>
     <w:p>
       <w:pPr>
@@ -3428,7 +3561,7 @@
                     <pic:cNvPicPr/>
                   </pic:nvPicPr>
                   <pic:blipFill>
-                    <a:blip r:embed="rId16"/>
+                    <a:blip r:embed="rId17"/>
                     <a:stretch>
                       <a:fillRect/>
                     </a:stretch>
@@ -3461,6 +3594,7 @@
         <w:ind w:right="380" w:hanging="360"/>
       </w:pPr>
       <w:r>
+        <w:lastRenderedPageBreak/>
         <w:t xml:space="preserve">¿Qué técnica de modulación se está representando? </w:t>
       </w:r>
     </w:p>
@@ -3509,7 +3643,7 @@
                     <pic:cNvPicPr/>
                   </pic:nvPicPr>
                   <pic:blipFill>
-                    <a:blip r:embed="rId17"/>
+                    <a:blip r:embed="rId18"/>
                     <a:stretch>
                       <a:fillRect/>
                     </a:stretch>
@@ -3740,35 +3874,20 @@
         <w:spacing w:after="19" w:line="259" w:lineRule="auto"/>
       </w:pPr>
       <w:r>
-        <w:tab/>
-      </w:r>
-      <w:r>
-        <w:tab/>
-        <w:t>b)</w:t>
-      </w:r>
-      <w:r>
-        <w:tab/>
-      </w:r>
-    </w:p>
-    <w:p>
-      <w:pPr>
-        <w:spacing w:after="19" w:line="259" w:lineRule="auto"/>
-      </w:pPr>
-      <w:r>
         <w:rPr>
           <w:noProof/>
         </w:rPr>
         <w:drawing>
-          <wp:anchor distT="0" distB="0" distL="114300" distR="114300" simplePos="0" relativeHeight="251660288" behindDoc="1" locked="0" layoutInCell="1" allowOverlap="1" wp14:anchorId="1A998BCF" wp14:editId="430E6486">
+          <wp:anchor distT="0" distB="0" distL="114300" distR="114300" simplePos="0" relativeHeight="251660288" behindDoc="1" locked="0" layoutInCell="1" allowOverlap="1" wp14:anchorId="1A998BCF" wp14:editId="7F5008B7">
             <wp:simplePos x="0" y="0"/>
             <wp:positionH relativeFrom="margin">
               <wp:align>center</wp:align>
             </wp:positionH>
             <wp:positionV relativeFrom="paragraph">
-              <wp:posOffset>262890</wp:posOffset>
+              <wp:posOffset>7538</wp:posOffset>
             </wp:positionV>
-            <wp:extent cx="7639050" cy="2324358"/>
-            <wp:effectExtent l="0" t="0" r="0" b="0"/>
+            <wp:extent cx="5674230" cy="1726516"/>
+            <wp:effectExtent l="0" t="0" r="3175" b="7620"/>
             <wp:wrapNone/>
             <wp:docPr id="2" name="Imagen 2"/>
             <wp:cNvGraphicFramePr>
@@ -3784,7 +3903,7 @@
                     </pic:cNvPicPr>
                   </pic:nvPicPr>
                   <pic:blipFill>
-                    <a:blip r:embed="rId18">
+                    <a:blip r:embed="rId19">
                       <a:extLst>
                         <a:ext uri="{28A0092B-C50C-407E-A947-70E740481C1C}">
                           <a14:useLocalDpi xmlns:a14="http://schemas.microsoft.com/office/drawing/2010/main" val="0"/>
@@ -3799,7 +3918,7 @@
                   <pic:spPr bwMode="auto">
                     <a:xfrm>
                       <a:off x="0" y="0"/>
-                      <a:ext cx="7639050" cy="2324358"/>
+                      <a:ext cx="5674230" cy="1726516"/>
                     </a:xfrm>
                     <a:prstGeom prst="rect">
                       <a:avLst/>
@@ -3821,6 +3940,21 @@
           </wp:anchor>
         </w:drawing>
       </w:r>
+      <w:r>
+        <w:tab/>
+      </w:r>
+      <w:r>
+        <w:tab/>
+        <w:t>b)</w:t>
+      </w:r>
+      <w:r>
+        <w:tab/>
+      </w:r>
+    </w:p>
+    <w:p>
+      <w:pPr>
+        <w:spacing w:after="19" w:line="259" w:lineRule="auto"/>
+      </w:pPr>
     </w:p>
     <w:p>
       <w:pPr>
@@ -3837,90 +3971,16 @@
     <w:p>
       <w:pPr>
         <w:spacing w:after="19" w:line="259" w:lineRule="auto"/>
-        <w:ind w:left="1440" w:firstLine="0"/>
-      </w:pPr>
-    </w:p>
-    <w:p>
-      <w:pPr>
-        <w:spacing w:after="19" w:line="259" w:lineRule="auto"/>
-        <w:ind w:left="1440" w:firstLine="0"/>
-      </w:pPr>
-    </w:p>
-    <w:p>
-      <w:pPr>
-        <w:spacing w:after="19" w:line="259" w:lineRule="auto"/>
-        <w:ind w:left="1440" w:firstLine="0"/>
-      </w:pPr>
-    </w:p>
-    <w:p>
-      <w:pPr>
-        <w:spacing w:after="19" w:line="259" w:lineRule="auto"/>
-        <w:ind w:left="1440" w:firstLine="0"/>
-      </w:pPr>
-    </w:p>
-    <w:p>
-      <w:pPr>
-        <w:spacing w:after="19" w:line="259" w:lineRule="auto"/>
-        <w:ind w:left="1440" w:firstLine="0"/>
-      </w:pPr>
-    </w:p>
-    <w:p>
-      <w:pPr>
-        <w:spacing w:after="19" w:line="259" w:lineRule="auto"/>
-        <w:ind w:left="1440" w:firstLine="0"/>
-      </w:pPr>
-    </w:p>
-    <w:p>
-      <w:pPr>
-        <w:spacing w:after="19" w:line="259" w:lineRule="auto"/>
-      </w:pPr>
-      <w:r>
-        <w:tab/>
-      </w:r>
-      <w:r>
-        <w:tab/>
-      </w:r>
-    </w:p>
-    <w:p>
-      <w:pPr>
-        <w:spacing w:after="19" w:line="259" w:lineRule="auto"/>
-      </w:pPr>
-    </w:p>
-    <w:p>
-      <w:pPr>
-        <w:spacing w:after="19" w:line="259" w:lineRule="auto"/>
-      </w:pPr>
-    </w:p>
-    <w:p>
-      <w:pPr>
-        <w:spacing w:after="19" w:line="259" w:lineRule="auto"/>
-      </w:pPr>
-    </w:p>
-    <w:p>
-      <w:pPr>
-        <w:spacing w:after="19" w:line="259" w:lineRule="auto"/>
-      </w:pPr>
-    </w:p>
-    <w:p>
-      <w:pPr>
-        <w:spacing w:after="19" w:line="259" w:lineRule="auto"/>
-      </w:pPr>
-    </w:p>
-    <w:p>
-      <w:pPr>
-        <w:spacing w:after="19" w:line="259" w:lineRule="auto"/>
-      </w:pPr>
-    </w:p>
-    <w:p>
-      <w:pPr>
-        <w:spacing w:after="19" w:line="259" w:lineRule="auto"/>
-      </w:pPr>
-    </w:p>
-    <w:p>
-      <w:pPr>
-        <w:spacing w:after="19" w:line="259" w:lineRule="auto"/>
-      </w:pPr>
-      <w:r>
+        <w:ind w:left="0" w:firstLine="0"/>
+      </w:pPr>
+    </w:p>
+    <w:p>
+      <w:pPr>
+        <w:spacing w:after="19" w:line="259" w:lineRule="auto"/>
+        <w:ind w:left="0" w:firstLine="0"/>
+      </w:pPr>
+      <w:r>
+        <w:lastRenderedPageBreak/>
         <w:t xml:space="preserve">c) </w:t>
       </w:r>
     </w:p>
@@ -3930,7 +3990,6 @@
         <w:ind w:firstLine="698"/>
       </w:pPr>
       <w:r>
-        <w:lastRenderedPageBreak/>
         <w:t>Otras técnicas de modulación basadas en los mismos principios</w:t>
       </w:r>
     </w:p>
@@ -4201,170 +4260,6 @@
       </w:pPr>
       <w:r>
         <w:rPr>
-          <w:noProof/>
-        </w:rPr>
-        <w:drawing>
-          <wp:inline distT="0" distB="0" distL="0" distR="0" wp14:anchorId="02AFA3FA" wp14:editId="27326D96">
-            <wp:extent cx="4019550" cy="1600200"/>
-            <wp:effectExtent l="0" t="0" r="0" b="0"/>
-            <wp:docPr id="1543" name="Picture 1543"/>
-            <wp:cNvGraphicFramePr/>
-            <a:graphic xmlns:a="http://schemas.openxmlformats.org/drawingml/2006/main">
-              <a:graphicData uri="http://schemas.openxmlformats.org/drawingml/2006/picture">
-                <pic:pic xmlns:pic="http://schemas.openxmlformats.org/drawingml/2006/picture">
-                  <pic:nvPicPr>
-                    <pic:cNvPr id="1543" name="Picture 1543"/>
-                    <pic:cNvPicPr/>
-                  </pic:nvPicPr>
-                  <pic:blipFill>
-                    <a:blip r:embed="rId19"/>
-                    <a:stretch>
-                      <a:fillRect/>
-                    </a:stretch>
-                  </pic:blipFill>
-                  <pic:spPr>
-                    <a:xfrm>
-                      <a:off x="0" y="0"/>
-                      <a:ext cx="4019550" cy="1600200"/>
-                    </a:xfrm>
-                    <a:prstGeom prst="rect">
-                      <a:avLst/>
-                    </a:prstGeom>
-                  </pic:spPr>
-                </pic:pic>
-              </a:graphicData>
-            </a:graphic>
-          </wp:inline>
-        </w:drawing>
-      </w:r>
-      <w:r>
-        <w:t xml:space="preserve"> </w:t>
-      </w:r>
-    </w:p>
-    <w:p>
-      <w:pPr>
-        <w:spacing w:after="19" w:line="259" w:lineRule="auto"/>
-        <w:ind w:left="0" w:right="345" w:firstLine="0"/>
-        <w:jc w:val="center"/>
-      </w:pPr>
-      <w:r>
-        <w:t xml:space="preserve"> </w:t>
-      </w:r>
-    </w:p>
-    <w:p>
-      <w:pPr>
-        <w:spacing w:after="19" w:line="259" w:lineRule="auto"/>
-        <w:ind w:left="0" w:right="345" w:firstLine="0"/>
-        <w:jc w:val="center"/>
-      </w:pPr>
-      <w:r>
-        <w:t xml:space="preserve"> </w:t>
-      </w:r>
-    </w:p>
-    <w:p>
-      <w:pPr>
-        <w:spacing w:after="0" w:line="259" w:lineRule="auto"/>
-        <w:ind w:left="0" w:firstLine="0"/>
-      </w:pPr>
-      <w:r>
-        <w:t xml:space="preserve"> </w:t>
-      </w:r>
-    </w:p>
-    <w:p>
-      <w:pPr>
-        <w:ind w:right="380"/>
-      </w:pPr>
-      <w:r>
-        <w:t xml:space="preserve">Seguir los pasos y responder las preguntas: </w:t>
-      </w:r>
-    </w:p>
-    <w:p>
-      <w:pPr>
-        <w:spacing w:after="19" w:line="259" w:lineRule="auto"/>
-        <w:ind w:left="0" w:firstLine="0"/>
-      </w:pPr>
-      <w:r>
-        <w:t xml:space="preserve"> </w:t>
-      </w:r>
-    </w:p>
-    <w:p>
-      <w:pPr>
-        <w:numPr>
-          <w:ilvl w:val="0"/>
-          <w:numId w:val="2"/>
-        </w:numPr>
-        <w:ind w:right="380" w:hanging="360"/>
-      </w:pPr>
-      <w:r>
-        <w:t xml:space="preserve">Colocar un </w:t>
-      </w:r>
-      <w:proofErr w:type="spellStart"/>
-      <w:r>
-        <w:t>router</w:t>
-      </w:r>
-      <w:proofErr w:type="spellEnd"/>
-      <w:r>
-        <w:t xml:space="preserve"> inalámbrico, que se encuentra bajo </w:t>
-      </w:r>
-      <w:proofErr w:type="spellStart"/>
-      <w:r>
-        <w:t>network-devices</w:t>
-      </w:r>
-      <w:proofErr w:type="spellEnd"/>
-      <w:r>
-        <w:t xml:space="preserve"> &gt; </w:t>
-      </w:r>
-      <w:proofErr w:type="spellStart"/>
-      <w:r>
-        <w:t>wireless-devices</w:t>
-      </w:r>
-      <w:proofErr w:type="spellEnd"/>
-      <w:r>
-        <w:t xml:space="preserve">: </w:t>
-      </w:r>
-    </w:p>
-    <w:p>
-      <w:pPr>
-        <w:numPr>
-          <w:ilvl w:val="0"/>
-          <w:numId w:val="2"/>
-        </w:numPr>
-        <w:ind w:right="380" w:hanging="360"/>
-      </w:pPr>
-      <w:r>
-        <w:t xml:space="preserve">Configurar el </w:t>
-      </w:r>
-      <w:proofErr w:type="spellStart"/>
-      <w:r>
-        <w:t>router</w:t>
-      </w:r>
-      <w:proofErr w:type="spellEnd"/>
-      <w:r>
-        <w:t xml:space="preserve">, haciendo </w:t>
-      </w:r>
-      <w:proofErr w:type="spellStart"/>
-      <w:r>
-        <w:t>click</w:t>
-      </w:r>
-      <w:proofErr w:type="spellEnd"/>
-      <w:r>
-        <w:t xml:space="preserve"> sobre el mismo y desplegando sus opciones, de tal </w:t>
-      </w:r>
-    </w:p>
-    <w:p>
-      <w:pPr>
-        <w:ind w:left="730" w:right="380"/>
-      </w:pPr>
-      <w:r>
-        <w:t xml:space="preserve">manera que la dirección de IP sea 192.168.0.1 y la máscara de subred </w:t>
-      </w:r>
-    </w:p>
-    <w:p>
-      <w:pPr>
-        <w:ind w:left="730" w:right="2716"/>
-      </w:pPr>
-      <w:r>
-        <w:rPr>
           <w:rFonts w:ascii="Calibri" w:eastAsia="Calibri" w:hAnsi="Calibri" w:cs="Calibri"/>
           <w:noProof/>
           <w:sz w:val="22"/>
@@ -4372,13 +4267,13 @@
         <mc:AlternateContent>
           <mc:Choice Requires="wpg">
             <w:drawing>
-              <wp:anchor distT="0" distB="0" distL="114300" distR="114300" simplePos="0" relativeHeight="251658240" behindDoc="1" locked="0" layoutInCell="1" allowOverlap="1" wp14:anchorId="54A2DD13" wp14:editId="0707FA9F">
+              <wp:anchor distT="0" distB="0" distL="114300" distR="114300" simplePos="0" relativeHeight="251658240" behindDoc="1" locked="0" layoutInCell="1" allowOverlap="1" wp14:anchorId="54A2DD13" wp14:editId="1FD25DFD">
                 <wp:simplePos x="0" y="0"/>
                 <wp:positionH relativeFrom="column">
-                  <wp:posOffset>2667000</wp:posOffset>
+                  <wp:posOffset>2746513</wp:posOffset>
                 </wp:positionH>
                 <wp:positionV relativeFrom="paragraph">
-                  <wp:posOffset>-1513711</wp:posOffset>
+                  <wp:posOffset>1545038</wp:posOffset>
                 </wp:positionV>
                 <wp:extent cx="4086226" cy="2632711"/>
                 <wp:effectExtent l="0" t="0" r="0" b="0"/>
@@ -4445,20 +4340,203 @@
               </wp:anchor>
             </w:drawing>
           </mc:Choice>
-          <mc:Fallback xmlns:a="http://schemas.openxmlformats.org/drawingml/2006/main">
+          <mc:Fallback>
             <w:pict>
-              <v:group id="Group 10757" style="width:321.75pt;height:207.3pt;position:absolute;z-index:-2147483248;mso-position-horizontal-relative:text;mso-position-horizontal:absolute;margin-left:210pt;mso-position-vertical-relative:text;margin-top:-119.19pt;" coordsize="40862,26327">
-                <v:shape id="Picture 1952" style="position:absolute;width:40576;height:10572;left:0;top:0;" filled="f">
-                  <v:imagedata r:id="rId22"/>
+              <v:group w14:anchorId="3965088B" id="Group 10757" o:spid="_x0000_s1026" style="position:absolute;margin-left:216.25pt;margin-top:121.65pt;width:321.75pt;height:207.3pt;z-index:-251658240" coordsize="40862,26327" o:gfxdata="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">
+                <v:shapetype id="_x0000_t75" coordsize="21600,21600" o:spt="75" o:preferrelative="t" path="m@4@5l@4@11@9@11@9@5xe" filled="f" stroked="f">
+                  <v:stroke joinstyle="miter"/>
+                  <v:formulas>
+                    <v:f eqn="if lineDrawn pixelLineWidth 0"/>
+                    <v:f eqn="sum @0 1 0"/>
+                    <v:f eqn="sum 0 0 @1"/>
+                    <v:f eqn="prod @2 1 2"/>
+                    <v:f eqn="prod @3 21600 pixelWidth"/>
+                    <v:f eqn="prod @3 21600 pixelHeight"/>
+                    <v:f eqn="sum @0 0 1"/>
+                    <v:f eqn="prod @6 1 2"/>
+                    <v:f eqn="prod @7 21600 pixelWidth"/>
+                    <v:f eqn="sum @8 21600 0"/>
+                    <v:f eqn="prod @7 21600 pixelHeight"/>
+                    <v:f eqn="sum @10 21600 0"/>
+                  </v:formulas>
+                  <v:path o:extrusionok="f" gradientshapeok="t" o:connecttype="rect"/>
+                  <o:lock v:ext="edit" aspectratio="t"/>
+                </v:shapetype>
+                <v:shape id="Picture 1952" o:spid="_x0000_s1027" type="#_x0000_t75" style="position:absolute;width:40576;height:10572;visibility:visible;mso-wrap-style:square" o:gfxdata="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">
+                  <v:imagedata r:id="rId22" o:title=""/>
                 </v:shape>
-                <v:shape id="Picture 1954" style="position:absolute;width:12573;height:14001;left:28289;top:12325;" filled="f">
-                  <v:imagedata r:id="rId23"/>
+                <v:shape id="Picture 1954" o:spid="_x0000_s1028" type="#_x0000_t75" style="position:absolute;left:28289;top:12325;width:12573;height:14002;visibility:visible;mso-wrap-style:square" o:gfxdata="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">
+                  <v:imagedata r:id="rId23" o:title=""/>
                 </v:shape>
               </v:group>
             </w:pict>
           </mc:Fallback>
         </mc:AlternateContent>
       </w:r>
+      <w:r>
+        <w:rPr>
+          <w:noProof/>
+        </w:rPr>
+        <w:drawing>
+          <wp:inline distT="0" distB="0" distL="0" distR="0" wp14:anchorId="02AFA3FA" wp14:editId="226ADFCF">
+            <wp:extent cx="4019550" cy="1600200"/>
+            <wp:effectExtent l="0" t="0" r="0" b="0"/>
+            <wp:docPr id="1543" name="Picture 1543"/>
+            <wp:cNvGraphicFramePr/>
+            <a:graphic xmlns:a="http://schemas.openxmlformats.org/drawingml/2006/main">
+              <a:graphicData uri="http://schemas.openxmlformats.org/drawingml/2006/picture">
+                <pic:pic xmlns:pic="http://schemas.openxmlformats.org/drawingml/2006/picture">
+                  <pic:nvPicPr>
+                    <pic:cNvPr id="1543" name="Picture 1543"/>
+                    <pic:cNvPicPr/>
+                  </pic:nvPicPr>
+                  <pic:blipFill>
+                    <a:blip r:embed="rId24"/>
+                    <a:stretch>
+                      <a:fillRect/>
+                    </a:stretch>
+                  </pic:blipFill>
+                  <pic:spPr>
+                    <a:xfrm>
+                      <a:off x="0" y="0"/>
+                      <a:ext cx="4019550" cy="1600200"/>
+                    </a:xfrm>
+                    <a:prstGeom prst="rect">
+                      <a:avLst/>
+                    </a:prstGeom>
+                  </pic:spPr>
+                </pic:pic>
+              </a:graphicData>
+            </a:graphic>
+          </wp:inline>
+        </w:drawing>
+      </w:r>
+      <w:r>
+        <w:t xml:space="preserve"> </w:t>
+      </w:r>
+    </w:p>
+    <w:p>
+      <w:pPr>
+        <w:spacing w:after="19" w:line="259" w:lineRule="auto"/>
+        <w:ind w:left="0" w:right="345" w:firstLine="0"/>
+        <w:jc w:val="center"/>
+      </w:pPr>
+      <w:r>
+        <w:t xml:space="preserve"> </w:t>
+      </w:r>
+    </w:p>
+    <w:p>
+      <w:pPr>
+        <w:spacing w:after="19" w:line="259" w:lineRule="auto"/>
+        <w:ind w:left="0" w:right="345" w:firstLine="0"/>
+        <w:jc w:val="center"/>
+      </w:pPr>
+      <w:r>
+        <w:t xml:space="preserve"> </w:t>
+      </w:r>
+    </w:p>
+    <w:p>
+      <w:pPr>
+        <w:spacing w:after="0" w:line="259" w:lineRule="auto"/>
+        <w:ind w:left="0" w:firstLine="0"/>
+      </w:pPr>
+      <w:r>
+        <w:t xml:space="preserve"> </w:t>
+      </w:r>
+    </w:p>
+    <w:p>
+      <w:pPr>
+        <w:ind w:right="380"/>
+      </w:pPr>
+      <w:r>
+        <w:t xml:space="preserve">Seguir los pasos y responder las preguntas: </w:t>
+      </w:r>
+    </w:p>
+    <w:p>
+      <w:pPr>
+        <w:spacing w:after="19" w:line="259" w:lineRule="auto"/>
+        <w:ind w:left="0" w:firstLine="0"/>
+      </w:pPr>
+      <w:r>
+        <w:t xml:space="preserve"> </w:t>
+      </w:r>
+    </w:p>
+    <w:p>
+      <w:pPr>
+        <w:numPr>
+          <w:ilvl w:val="0"/>
+          <w:numId w:val="2"/>
+        </w:numPr>
+        <w:ind w:right="380" w:hanging="360"/>
+      </w:pPr>
+      <w:r>
+        <w:t xml:space="preserve">Colocar un </w:t>
+      </w:r>
+      <w:proofErr w:type="spellStart"/>
+      <w:r>
+        <w:t>router</w:t>
+      </w:r>
+      <w:proofErr w:type="spellEnd"/>
+      <w:r>
+        <w:t xml:space="preserve"> inalámbrico, que se encuentra bajo </w:t>
+      </w:r>
+      <w:proofErr w:type="spellStart"/>
+      <w:r>
+        <w:t>network-devices</w:t>
+      </w:r>
+      <w:proofErr w:type="spellEnd"/>
+      <w:r>
+        <w:t xml:space="preserve"> &gt; </w:t>
+      </w:r>
+      <w:proofErr w:type="spellStart"/>
+      <w:r>
+        <w:t>wireless-devices</w:t>
+      </w:r>
+      <w:proofErr w:type="spellEnd"/>
+      <w:r>
+        <w:t xml:space="preserve">: </w:t>
+      </w:r>
+    </w:p>
+    <w:p>
+      <w:pPr>
+        <w:numPr>
+          <w:ilvl w:val="0"/>
+          <w:numId w:val="2"/>
+        </w:numPr>
+        <w:ind w:right="380" w:hanging="360"/>
+      </w:pPr>
+      <w:r>
+        <w:t xml:space="preserve">Configurar el </w:t>
+      </w:r>
+      <w:proofErr w:type="spellStart"/>
+      <w:r>
+        <w:t>router</w:t>
+      </w:r>
+      <w:proofErr w:type="spellEnd"/>
+      <w:r>
+        <w:t xml:space="preserve">, haciendo </w:t>
+      </w:r>
+      <w:proofErr w:type="spellStart"/>
+      <w:r>
+        <w:t>click</w:t>
+      </w:r>
+      <w:proofErr w:type="spellEnd"/>
+      <w:r>
+        <w:t xml:space="preserve"> sobre el mismo y desplegando sus opciones, de tal </w:t>
+      </w:r>
+    </w:p>
+    <w:p>
+      <w:pPr>
+        <w:ind w:left="730" w:right="380"/>
+      </w:pPr>
+      <w:r>
+        <w:t xml:space="preserve">manera que la dirección de IP sea 192.168.0.1 y la máscara de subred </w:t>
+      </w:r>
+    </w:p>
+    <w:p>
+      <w:pPr>
+        <w:ind w:left="730" w:right="2716"/>
+      </w:pPr>
       <w:r>
         <w:t xml:space="preserve">255.255.255.0. Pongan un nombre que les guste (SSID) a la red, y configuren la seguridad </w:t>
       </w:r>
@@ -4619,7 +4697,7 @@
                     <pic:cNvPicPr/>
                   </pic:nvPicPr>
                   <pic:blipFill>
-                    <a:blip r:embed="rId24"/>
+                    <a:blip r:embed="rId25"/>
                     <a:stretch>
                       <a:fillRect/>
                     </a:stretch>
@@ -4758,7 +4836,7 @@
                     <pic:cNvPicPr/>
                   </pic:nvPicPr>
                   <pic:blipFill>
-                    <a:blip r:embed="rId25"/>
+                    <a:blip r:embed="rId26"/>
                     <a:stretch>
                       <a:fillRect/>
                     </a:stretch>
@@ -4852,7 +4930,7 @@
                     <pic:cNvPicPr/>
                   </pic:nvPicPr>
                   <pic:blipFill>
-                    <a:blip r:embed="rId26"/>
+                    <a:blip r:embed="rId27"/>
                     <a:stretch>
                       <a:fillRect/>
                     </a:stretch>
@@ -4941,7 +5019,7 @@
                           <pic:cNvPicPr/>
                         </pic:nvPicPr>
                         <pic:blipFill>
-                          <a:blip r:embed="rId27"/>
+                          <a:blip r:embed="rId28"/>
                           <a:stretch>
                             <a:fillRect/>
                           </a:stretch>
@@ -4962,7 +5040,7 @@
                           <pic:cNvPicPr/>
                         </pic:nvPicPr>
                         <pic:blipFill>
-                          <a:blip r:embed="rId28"/>
+                          <a:blip r:embed="rId29"/>
                           <a:stretch>
                             <a:fillRect/>
                           </a:stretch>
@@ -5006,10 +5084,10 @@
                   <o:lock v:ext="edit" aspectratio="t"/>
                 </v:shapetype>
                 <v:shape id="Picture 2332" o:spid="_x0000_s1027" type="#_x0000_t75" style="position:absolute;top:95;width:19716;height:19431;visibility:visible;mso-wrap-style:square" o:gfxdata="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">
-                  <v:imagedata r:id="rId29" o:title=""/>
+                  <v:imagedata r:id="rId30" o:title=""/>
                 </v:shape>
                 <v:shape id="Picture 2334" o:spid="_x0000_s1028" type="#_x0000_t75" style="position:absolute;left:20097;width:20860;height:19526;visibility:visible;mso-wrap-style:square" o:gfxdata="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">
-                  <v:imagedata r:id="rId30" o:title=""/>
+                  <v:imagedata r:id="rId31" o:title=""/>
                 </v:shape>
                 <w10:anchorlock/>
               </v:group>
@@ -5148,7 +5226,7 @@
                     </pic:cNvPicPr>
                   </pic:nvPicPr>
                   <pic:blipFill>
-                    <a:blip r:embed="rId31">
+                    <a:blip r:embed="rId32">
                       <a:extLst>
                         <a:ext uri="{28A0092B-C50C-407E-A947-70E740481C1C}">
                           <a14:useLocalDpi xmlns:a14="http://schemas.microsoft.com/office/drawing/2010/main" val="0"/>
@@ -5383,7 +5461,7 @@
           <w:noProof/>
         </w:rPr>
         <w:drawing>
-          <wp:anchor distT="0" distB="0" distL="114300" distR="114300" simplePos="0" relativeHeight="251662336" behindDoc="1" locked="0" layoutInCell="1" allowOverlap="1" wp14:anchorId="6FF79337" wp14:editId="25C08DD2">
+          <wp:anchor distT="0" distB="0" distL="114300" distR="114300" simplePos="0" relativeHeight="251662336" behindDoc="1" locked="0" layoutInCell="1" allowOverlap="1" wp14:anchorId="6FF79337" wp14:editId="56655C3C">
             <wp:simplePos x="0" y="0"/>
             <wp:positionH relativeFrom="page">
               <wp:posOffset>419100</wp:posOffset>
@@ -5408,7 +5486,7 @@
                     </pic:cNvPicPr>
                   </pic:nvPicPr>
                   <pic:blipFill>
-                    <a:blip r:embed="rId32" cstate="print">
+                    <a:blip r:embed="rId33" cstate="print">
                       <a:extLst>
                         <a:ext uri="{28A0092B-C50C-407E-A947-70E740481C1C}">
                           <a14:useLocalDpi xmlns:a14="http://schemas.microsoft.com/office/drawing/2010/main" val="0"/>
@@ -5674,7 +5752,7 @@
                     </pic:cNvPicPr>
                   </pic:nvPicPr>
                   <pic:blipFill>
-                    <a:blip r:embed="rId33">
+                    <a:blip r:embed="rId34">
                       <a:extLst>
                         <a:ext uri="{28A0092B-C50C-407E-A947-70E740481C1C}">
                           <a14:useLocalDpi xmlns:a14="http://schemas.microsoft.com/office/drawing/2010/main" val="0"/>
@@ -5905,12 +5983,12 @@
       </w:pPr>
     </w:p>
     <w:sectPr>
-      <w:headerReference w:type="even" r:id="rId34"/>
-      <w:headerReference w:type="default" r:id="rId35"/>
-      <w:footerReference w:type="even" r:id="rId36"/>
-      <w:footerReference w:type="default" r:id="rId37"/>
-      <w:headerReference w:type="first" r:id="rId38"/>
-      <w:footerReference w:type="first" r:id="rId39"/>
+      <w:headerReference w:type="even" r:id="rId35"/>
+      <w:headerReference w:type="default" r:id="rId36"/>
+      <w:footerReference w:type="even" r:id="rId37"/>
+      <w:footerReference w:type="default" r:id="rId38"/>
+      <w:headerReference w:type="first" r:id="rId39"/>
+      <w:footerReference w:type="first" r:id="rId40"/>
       <w:pgSz w:w="12240" w:h="15840"/>
       <w:pgMar w:top="1548" w:right="358" w:bottom="1469" w:left="850" w:header="345" w:footer="996" w:gutter="0"/>
       <w:cols w:space="720"/>
@@ -9194,6 +9272,7 @@
   <w:style w:type="character" w:default="1" w:styleId="Fuentedeprrafopredeter">
     <w:name w:val="Default Paragraph Font"/>
     <w:uiPriority w:val="1"/>
+    <w:semiHidden/>
     <w:unhideWhenUsed/>
   </w:style>
   <w:style w:type="table" w:default="1" w:styleId="Tablanormal">

</xml_diff>